<commit_message>
ПМИ dtz1 и dtz2
</commit_message>
<xml_diff>
--- a/PMI-DZT2/output/tmpl.docx
+++ b/PMI-DZT2/output/tmpl.docx
@@ -196,7 +196,7 @@
                 <w:szCs w:val="28"/>
                 <w:lang w:val="en-US"/>
               </w:rPr>
-              <w:t xml:space="preserve">Проверка взаимосвязей схемы ФСУ в части дифференциальной токовой отсечки (ДТО)</w:t>
+              <w:t xml:space="preserve">Проверка взаимосвязей схемы ФСУ в части дифференциальной токовой защиты с торможением (ДТЗт). Проверка взаимодействия с КЦТ.</w:t>
             </w:r>
           </w:p>
         </w:tc>
@@ -632,7 +632,7 @@
             <w:rPr>
               <w:lang w:val="en-US"/>
             </w:rPr>
-            <w:t xml:space="preserve">Взаимодействие функций ФСУ в части ДТО</w:t>
+            <w:t xml:space="preserve">Взаимодействие функций ФСУ в части ДТЗт</w:t>
           </w:r>
           <w:r>
             <w:t>)</w:t>

</xml_diff>

<commit_message>
ПМИ tkzdz и torpn
</commit_message>
<xml_diff>
--- a/PMI-DZT2/output/tmpl.docx
+++ b/PMI-DZT2/output/tmpl.docx
@@ -196,7 +196,7 @@
                 <w:szCs w:val="28"/>
                 <w:lang w:val="en-US"/>
               </w:rPr>
-              <w:t xml:space="preserve">Проверка взаимосвязей схемы ФСУ в части токовых органов пуска охлаждения трансформатора (РТПО)</w:t>
+              <w:t xml:space="preserve">Проверка взаимосвязей схемы ФСУ в части токового органа блокировки РПН (ТО РПН)</w:t>
             </w:r>
           </w:p>
         </w:tc>
@@ -632,7 +632,7 @@
             <w:rPr>
               <w:lang w:val="en-US"/>
             </w:rPr>
-            <w:t xml:space="preserve">Взаимодействие функций ФСУ в части РТПО</w:t>
+            <w:t xml:space="preserve">Взаимодействие функций ФСУ в части ТО РПН</w:t>
           </w:r>
           <w:r>
             <w:t>)</w:t>

</xml_diff>